<commit_message>
Add architecture diagram to report
</commit_message>
<xml_diff>
--- a/report/MLOps_Assignment1_Report.docx
+++ b/report/MLOps_Assignment1_Report.docx
@@ -294,7 +294,7 @@
       </w:tr>
     </w:tbl>
     <w:bookmarkEnd w:id="10"/>
-    <w:bookmarkStart w:id="11" w:name="architecture"/>
+    <w:bookmarkStart w:id="14" w:name="architecture"/>
     <w:p>
       <w:pPr>
         <w:pStyle w:val="Heading1"/>
@@ -303,31 +303,53 @@
         <w:t xml:space="preserve">2. Architecture</w:t>
       </w:r>
     </w:p>
-    <w:tbl>
-      <w:tblPr>
-        <w:tblStyle w:val="FigureTable"/>
-        <w:tblW w:type="auto" w:w="0"/>
-        <w:jc w:val="center"/>
-        <w:tblLook w:firstRow="0" w:lastRow="0" w:firstColumn="0" w:lastColumn="0"/>
-      </w:tblPr>
-      <w:tblGrid>
-        <w:gridCol w:w="7920"/>
-      </w:tblGrid>
-      <w:tr>
-        <w:tc>
-          <w:tcPr/>
-          <w:p>
-            <w:pPr>
-              <w:pStyle w:val="Compact"/>
-              <w:jc w:val="center"/>
-            </w:pPr>
-            <w:r>
-              <w:t xml:space="preserve">Figure 1: End-to-end architecture (rendered from the README)</w:t>
-            </w:r>
-          </w:p>
-        </w:tc>
-      </w:tr>
-    </w:tbl>
+    <w:p>
+      <w:pPr>
+        <w:pStyle w:val="CaptionedFigure"/>
+      </w:pPr>
+      <w:r>
+        <w:drawing>
+          <wp:inline>
+            <wp:extent cx="5334000" cy="1922328"/>
+            <wp:effectExtent b="0" l="0" r="0" t="0"/>
+            <wp:docPr descr="Figure 1: End-to-end architecture (rendered from the README)" title="" id="12" name="Picture"/>
+            <a:graphic>
+              <a:graphicData uri="http://schemas.openxmlformats.org/drawingml/2006/picture">
+                <pic:pic>
+                  <pic:nvPicPr>
+                    <pic:cNvPr descr="../screenshots/architecture_diagram.png" id="13" name="Picture"/>
+                    <pic:cNvPicPr>
+                      <a:picLocks noChangeArrowheads="1" noChangeAspect="1"/>
+                    </pic:cNvPicPr>
+                  </pic:nvPicPr>
+                  <pic:blipFill>
+                    <a:blip r:embed="rId11"/>
+                    <a:stretch>
+                      <a:fillRect/>
+                    </a:stretch>
+                  </pic:blipFill>
+                  <pic:spPr bwMode="auto">
+                    <a:xfrm>
+                      <a:off x="0" y="0"/>
+                      <a:ext cx="5334000" cy="1922328"/>
+                    </a:xfrm>
+                    <a:prstGeom prst="rect">
+                      <a:avLst/>
+                    </a:prstGeom>
+                    <a:noFill/>
+                    <a:ln w="9525">
+                      <a:noFill/>
+                      <a:headEnd/>
+                      <a:tailEnd/>
+                    </a:ln>
+                  </pic:spPr>
+                </pic:pic>
+              </a:graphicData>
+            </a:graphic>
+          </wp:inline>
+        </w:drawing>
+      </w:r>
+    </w:p>
     <w:p>
       <w:pPr>
         <w:pStyle w:val="ImageCaption"/>
@@ -824,8 +846,8 @@
         </w:tc>
       </w:tr>
     </w:tbl>
-    <w:bookmarkEnd w:id="11"/>
-    <w:bookmarkStart w:id="12" w:name="setup-and-access-instructions"/>
+    <w:bookmarkEnd w:id="14"/>
+    <w:bookmarkStart w:id="15" w:name="setup-and-access-instructions"/>
     <w:p>
       <w:pPr>
         <w:pStyle w:val="Heading1"/>
@@ -1482,8 +1504,8 @@
         <w:t xml:space="preserve">.</w:t>
       </w:r>
     </w:p>
-    <w:bookmarkEnd w:id="12"/>
-    <w:bookmarkStart w:id="28" w:name="Xb1097bf672c9eb1fc0a05e48e0006c51348586b"/>
+    <w:bookmarkEnd w:id="15"/>
+    <w:bookmarkStart w:id="31" w:name="Xb1097bf672c9eb1fc0a05e48e0006c51348586b"/>
     <w:p>
       <w:pPr>
         <w:pStyle w:val="Heading1"/>
@@ -1492,7 +1514,7 @@
         <w:t xml:space="preserve">4. Data Acquisition and Exploratory Data Analysis</w:t>
       </w:r>
     </w:p>
-    <w:bookmarkStart w:id="13" w:name="dataset-choice"/>
+    <w:bookmarkStart w:id="16" w:name="dataset-choice"/>
     <w:p>
       <w:pPr>
         <w:pStyle w:val="Heading2"/>
@@ -1537,8 +1559,8 @@
         <w:t xml:space="preserve">found on Kaggle. It mostly repeats the same ~300 patients, so identical rows land in both the training and the test set and inflate accuracy, which is a form of data leakage.</w:t>
       </w:r>
     </w:p>
-    <w:bookmarkEnd w:id="13"/>
-    <w:bookmarkStart w:id="14" w:name="download-cleaning-and-validation"/>
+    <w:bookmarkEnd w:id="16"/>
+    <w:bookmarkStart w:id="17" w:name="download-cleaning-and-validation"/>
     <w:p>
       <w:pPr>
         <w:pStyle w:val="Heading2"/>
@@ -1815,8 +1837,8 @@
         <w:t xml:space="preserve">of it is recorded with every model as its data version.</w:t>
       </w:r>
     </w:p>
-    <w:bookmarkEnd w:id="14"/>
-    <w:bookmarkStart w:id="27" w:name="exploratory-analysis"/>
+    <w:bookmarkEnd w:id="17"/>
+    <w:bookmarkStart w:id="30" w:name="exploratory-analysis"/>
     <w:p>
       <w:pPr>
         <w:pStyle w:val="Heading2"/>
@@ -1854,18 +1876,18 @@
           <wp:inline>
             <wp:extent cx="4322064" cy="3450336"/>
             <wp:effectExtent b="0" l="0" r="0" t="0"/>
-            <wp:docPr descr="Figure 2: Class balance of the binary target" title="" id="16" name="Picture"/>
+            <wp:docPr descr="Figure 2: Class balance of the binary target" title="" id="19" name="Picture"/>
             <a:graphic>
               <a:graphicData uri="http://schemas.openxmlformats.org/drawingml/2006/picture">
                 <pic:pic>
                   <pic:nvPicPr>
-                    <pic:cNvPr descr="figures/01_class_balance.png" id="17" name="Picture"/>
+                    <pic:cNvPr descr="figures/01_class_balance.png" id="20" name="Picture"/>
                     <pic:cNvPicPr>
                       <a:picLocks noChangeArrowheads="1" noChangeAspect="1"/>
                     </pic:cNvPicPr>
                   </pic:nvPicPr>
                   <pic:blipFill>
-                    <a:blip r:embed="rId15"/>
+                    <a:blip r:embed="rId18"/>
                     <a:stretch>
                       <a:fillRect/>
                     </a:stretch>
@@ -1909,18 +1931,18 @@
           <wp:inline>
             <wp:extent cx="5334000" cy="2822754"/>
             <wp:effectExtent b="0" l="0" r="0" t="0"/>
-            <wp:docPr descr="Figure 3: Distributions of the numeric features" title="" id="19" name="Picture"/>
+            <wp:docPr descr="Figure 3: Distributions of the numeric features" title="" id="22" name="Picture"/>
             <a:graphic>
               <a:graphicData uri="http://schemas.openxmlformats.org/drawingml/2006/picture">
                 <pic:pic>
                   <pic:nvPicPr>
-                    <pic:cNvPr descr="figures/02_numeric_histograms.png" id="20" name="Picture"/>
+                    <pic:cNvPr descr="figures/02_numeric_histograms.png" id="23" name="Picture"/>
                     <pic:cNvPicPr>
                       <a:picLocks noChangeArrowheads="1" noChangeAspect="1"/>
                     </pic:cNvPicPr>
                   </pic:nvPicPr>
                   <pic:blipFill>
-                    <a:blip r:embed="rId18"/>
+                    <a:blip r:embed="rId21"/>
                     <a:stretch>
                       <a:fillRect/>
                     </a:stretch>
@@ -1964,18 +1986,18 @@
           <wp:inline>
             <wp:extent cx="5334000" cy="2652994"/>
             <wp:effectExtent b="0" l="0" r="0" t="0"/>
-            <wp:docPr descr="Figure 4: Disease rate by category for the categorical features" title="" id="22" name="Picture"/>
+            <wp:docPr descr="Figure 4: Disease rate by category for the categorical features" title="" id="25" name="Picture"/>
             <a:graphic>
               <a:graphicData uri="http://schemas.openxmlformats.org/drawingml/2006/picture">
                 <pic:pic>
                   <pic:nvPicPr>
-                    <pic:cNvPr descr="figures/03_categorical_disease_rate.png" id="23" name="Picture"/>
+                    <pic:cNvPr descr="figures/03_categorical_disease_rate.png" id="26" name="Picture"/>
                     <pic:cNvPicPr>
                       <a:picLocks noChangeArrowheads="1" noChangeAspect="1"/>
                     </pic:cNvPicPr>
                   </pic:nvPicPr>
                   <pic:blipFill>
-                    <a:blip r:embed="rId21"/>
+                    <a:blip r:embed="rId24"/>
                     <a:stretch>
                       <a:fillRect/>
                     </a:stretch>
@@ -2019,18 +2041,18 @@
           <wp:inline>
             <wp:extent cx="5334000" cy="4763518"/>
             <wp:effectExtent b="0" l="0" r="0" t="0"/>
-            <wp:docPr descr="Figure 5: Correlation heatmap" title="" id="25" name="Picture"/>
+            <wp:docPr descr="Figure 5: Correlation heatmap" title="" id="28" name="Picture"/>
             <a:graphic>
               <a:graphicData uri="http://schemas.openxmlformats.org/drawingml/2006/picture">
                 <pic:pic>
                   <pic:nvPicPr>
-                    <pic:cNvPr descr="figures/04_correlation_heatmap.png" id="26" name="Picture"/>
+                    <pic:cNvPr descr="figures/04_correlation_heatmap.png" id="29" name="Picture"/>
                     <pic:cNvPicPr>
                       <a:picLocks noChangeArrowheads="1" noChangeAspect="1"/>
                     </pic:cNvPicPr>
                   </pic:nvPicPr>
                   <pic:blipFill>
-                    <a:blip r:embed="rId24"/>
+                    <a:blip r:embed="rId27"/>
                     <a:stretch>
                       <a:fillRect/>
                     </a:stretch>
@@ -2149,9 +2171,9 @@
         <w:t xml:space="preserve">How the heart reacts to exercise is one of the strongest signals. Patients with disease had a clearly lower maximum heart rate and higher ST depression, and exercise-induced angina was much more common among them. Cholesterol, which I expected to matter a lot, showed only a weak link to the target.</w:t>
       </w:r>
     </w:p>
-    <w:bookmarkEnd w:id="27"/>
-    <w:bookmarkEnd w:id="28"/>
-    <w:bookmarkStart w:id="36" w:name="Xa799d93673afa10bf90c9043574061a98caadb1"/>
+    <w:bookmarkEnd w:id="30"/>
+    <w:bookmarkEnd w:id="31"/>
+    <w:bookmarkStart w:id="39" w:name="Xa799d93673afa10bf90c9043574061a98caadb1"/>
     <w:p>
       <w:pPr>
         <w:pStyle w:val="Heading1"/>
@@ -2160,7 +2182,7 @@
         <w:t xml:space="preserve">5. Feature Engineering and Model Development</w:t>
       </w:r>
     </w:p>
-    <w:bookmarkStart w:id="29" w:name="features-and-preprocessing"/>
+    <w:bookmarkStart w:id="32" w:name="features-and-preprocessing"/>
     <w:p>
       <w:pPr>
         <w:pStyle w:val="Heading2"/>
@@ -2199,8 +2221,8 @@
         <w:t xml:space="preserve">, because their values are labels rather than quantities. Codes never seen during training are ignored instead of crashing the service. Each of these behaviours is covered by a unit test.</w:t>
       </w:r>
     </w:p>
-    <w:bookmarkEnd w:id="29"/>
-    <w:bookmarkStart w:id="30" w:name="models-tuning-and-selection"/>
+    <w:bookmarkEnd w:id="32"/>
+    <w:bookmarkStart w:id="33" w:name="models-tuning-and-selection"/>
     <w:p>
       <w:pPr>
         <w:pStyle w:val="Heading2"/>
@@ -2630,8 +2652,8 @@
         <w:t xml:space="preserve">.</w:t>
       </w:r>
     </w:p>
-    <w:bookmarkEnd w:id="30"/>
-    <w:bookmarkStart w:id="31" w:name="decision-threshold"/>
+    <w:bookmarkEnd w:id="33"/>
+    <w:bookmarkStart w:id="34" w:name="decision-threshold"/>
     <w:p>
       <w:pPr>
         <w:pStyle w:val="Heading2"/>
@@ -2673,8 +2695,8 @@
         <w:t xml:space="preserve">. The threshold is stored inside the saved model and in its metadata, so the API applies exactly the same rule.</w:t>
       </w:r>
     </w:p>
-    <w:bookmarkEnd w:id="31"/>
-    <w:bookmarkStart w:id="35" w:name="test-set-results"/>
+    <w:bookmarkEnd w:id="34"/>
+    <w:bookmarkStart w:id="38" w:name="test-set-results"/>
     <w:p>
       <w:pPr>
         <w:pStyle w:val="Heading2"/>
@@ -2898,18 +2920,18 @@
           <wp:inline>
             <wp:extent cx="5334000" cy="2355551"/>
             <wp:effectExtent b="0" l="0" r="0" t="0"/>
-            <wp:docPr descr="Figure 6: Final model on the test set (confusion matrix and ROC curve)" title="" id="33" name="Picture"/>
+            <wp:docPr descr="Figure 6: Final model on the test set (confusion matrix and ROC curve)" title="" id="36" name="Picture"/>
             <a:graphic>
               <a:graphicData uri="http://schemas.openxmlformats.org/drawingml/2006/picture">
                 <pic:pic>
                   <pic:nvPicPr>
-                    <pic:cNvPr descr="figures/05_final_model_test.png" id="34" name="Picture"/>
+                    <pic:cNvPr descr="figures/05_final_model_test.png" id="37" name="Picture"/>
                     <pic:cNvPicPr>
                       <a:picLocks noChangeArrowheads="1" noChangeAspect="1"/>
                     </pic:cNvPicPr>
                   </pic:nvPicPr>
                   <pic:blipFill>
-                    <a:blip r:embed="rId32"/>
+                    <a:blip r:embed="rId35"/>
                     <a:stretch>
                       <a:fillRect/>
                     </a:stretch>
@@ -2944,9 +2966,9 @@
         <w:t xml:space="preserve">Figure 6: Final model on the test set (confusion matrix and ROC curve)</w:t>
       </w:r>
     </w:p>
-    <w:bookmarkEnd w:id="35"/>
-    <w:bookmarkEnd w:id="36"/>
-    <w:bookmarkStart w:id="46" w:name="experiment-tracking-mlflow"/>
+    <w:bookmarkEnd w:id="38"/>
+    <w:bookmarkEnd w:id="39"/>
+    <w:bookmarkStart w:id="49" w:name="experiment-tracking-mlflow"/>
     <w:p>
       <w:pPr>
         <w:pStyle w:val="Heading1"/>
@@ -3069,18 +3091,18 @@
           <wp:inline>
             <wp:extent cx="5334000" cy="1419921"/>
             <wp:effectExtent b="0" l="0" r="0" t="0"/>
-            <wp:docPr descr="Figure 7: MLflow runs, with nested tuning runs under each model" title="" id="38" name="Picture"/>
+            <wp:docPr descr="Figure 7: MLflow runs, with nested tuning runs under each model" title="" id="41" name="Picture"/>
             <a:graphic>
               <a:graphicData uri="http://schemas.openxmlformats.org/drawingml/2006/picture">
                 <pic:pic>
                   <pic:nvPicPr>
-                    <pic:cNvPr descr="../screenshots/task3_mlflow_runs.png" id="39" name="Picture"/>
+                    <pic:cNvPr descr="../screenshots/task3_mlflow_runs.png" id="42" name="Picture"/>
                     <pic:cNvPicPr>
                       <a:picLocks noChangeArrowheads="1" noChangeAspect="1"/>
                     </pic:cNvPicPr>
                   </pic:nvPicPr>
                   <pic:blipFill>
-                    <a:blip r:embed="rId37"/>
+                    <a:blip r:embed="rId40"/>
                     <a:stretch>
                       <a:fillRect/>
                     </a:stretch>
@@ -3124,18 +3146,18 @@
           <wp:inline>
             <wp:extent cx="5334000" cy="1544658"/>
             <wp:effectExtent b="0" l="0" r="0" t="0"/>
-            <wp:docPr descr="Figure 8: MLflow comparison of the three models" title="" id="41" name="Picture"/>
+            <wp:docPr descr="Figure 8: MLflow comparison of the three models" title="" id="44" name="Picture"/>
             <a:graphic>
               <a:graphicData uri="http://schemas.openxmlformats.org/drawingml/2006/picture">
                 <pic:pic>
                   <pic:nvPicPr>
-                    <pic:cNvPr descr="../screenshots/task3_mlflow_compare.png" id="42" name="Picture"/>
+                    <pic:cNvPr descr="../screenshots/task3_mlflow_compare.png" id="45" name="Picture"/>
                     <pic:cNvPicPr>
                       <a:picLocks noChangeArrowheads="1" noChangeAspect="1"/>
                     </pic:cNvPicPr>
                   </pic:nvPicPr>
                   <pic:blipFill>
-                    <a:blip r:embed="rId40"/>
+                    <a:blip r:embed="rId43"/>
                     <a:stretch>
                       <a:fillRect/>
                     </a:stretch>
@@ -3179,18 +3201,18 @@
           <wp:inline>
             <wp:extent cx="5334000" cy="1981120"/>
             <wp:effectExtent b="0" l="0" r="0" t="0"/>
-            <wp:docPr descr="Figure 9: Final logged model with metrics, parameters and git lineage" title="" id="44" name="Picture"/>
+            <wp:docPr descr="Figure 9: Final logged model with metrics, parameters and git lineage" title="" id="47" name="Picture"/>
             <a:graphic>
               <a:graphicData uri="http://schemas.openxmlformats.org/drawingml/2006/picture">
                 <pic:pic>
                   <pic:nvPicPr>
-                    <pic:cNvPr descr="../screenshots/task3_mlflow_model_overview.png" id="45" name="Picture"/>
+                    <pic:cNvPr descr="../screenshots/task3_mlflow_model_overview.png" id="48" name="Picture"/>
                     <pic:cNvPicPr>
                       <a:picLocks noChangeArrowheads="1" noChangeAspect="1"/>
                     </pic:cNvPicPr>
                   </pic:nvPicPr>
                   <pic:blipFill>
-                    <a:blip r:embed="rId43"/>
+                    <a:blip r:embed="rId46"/>
                     <a:stretch>
                       <a:fillRect/>
                     </a:stretch>
@@ -3225,8 +3247,8 @@
         <w:t xml:space="preserve">Figure 9: Final logged model with metrics, parameters and git lineage</w:t>
       </w:r>
     </w:p>
-    <w:bookmarkEnd w:id="46"/>
-    <w:bookmarkStart w:id="50" w:name="model-packaging-and-reproducibility"/>
+    <w:bookmarkEnd w:id="49"/>
+    <w:bookmarkStart w:id="53" w:name="model-packaging-and-reproducibility"/>
     <w:p>
       <w:pPr>
         <w:pStyle w:val="Heading1"/>
@@ -3492,18 +3514,18 @@
           <wp:inline>
             <wp:extent cx="5334000" cy="3306637"/>
             <wp:effectExtent b="0" l="0" r="0" t="0"/>
-            <wp:docPr descr="Figure 10: MLflow model artifacts and environment files" title="" id="48" name="Picture"/>
+            <wp:docPr descr="Figure 10: MLflow model artifacts and environment files" title="" id="51" name="Picture"/>
             <a:graphic>
               <a:graphicData uri="http://schemas.openxmlformats.org/drawingml/2006/picture">
                 <pic:pic>
                   <pic:nvPicPr>
-                    <pic:cNvPr descr="../screenshots/task3_mlflow_model_artifacts.png" id="49" name="Picture"/>
+                    <pic:cNvPr descr="../screenshots/task3_mlflow_model_artifacts.png" id="52" name="Picture"/>
                     <pic:cNvPicPr>
                       <a:picLocks noChangeArrowheads="1" noChangeAspect="1"/>
                     </pic:cNvPicPr>
                   </pic:nvPicPr>
                   <pic:blipFill>
-                    <a:blip r:embed="rId47"/>
+                    <a:blip r:embed="rId50"/>
                     <a:stretch>
                       <a:fillRect/>
                     </a:stretch>
@@ -3538,8 +3560,8 @@
         <w:t xml:space="preserve">Figure 10: MLflow model artifacts and environment files</w:t>
       </w:r>
     </w:p>
-    <w:bookmarkEnd w:id="50"/>
-    <w:bookmarkStart w:id="66" w:name="cicd-pipeline-and-automated-testing"/>
+    <w:bookmarkEnd w:id="53"/>
+    <w:bookmarkStart w:id="69" w:name="cicd-pipeline-and-automated-testing"/>
     <w:p>
       <w:pPr>
         <w:pStyle w:val="Heading1"/>
@@ -3548,7 +3570,7 @@
         <w:t xml:space="preserve">8. CI/CD Pipeline and Automated Testing</w:t>
       </w:r>
     </w:p>
-    <w:bookmarkStart w:id="54" w:name="unit-tests"/>
+    <w:bookmarkStart w:id="57" w:name="unit-tests"/>
     <w:p>
       <w:pPr>
         <w:pStyle w:val="Heading2"/>
@@ -3752,18 +3774,18 @@
           <wp:inline>
             <wp:extent cx="5334000" cy="2587699"/>
             <wp:effectExtent b="0" l="0" r="0" t="0"/>
-            <wp:docPr descr="Figure 11: All 24 unit tests passing" title="" id="52" name="Picture"/>
+            <wp:docPr descr="Figure 11: All 24 unit tests passing" title="" id="55" name="Picture"/>
             <a:graphic>
               <a:graphicData uri="http://schemas.openxmlformats.org/drawingml/2006/picture">
                 <pic:pic>
                   <pic:nvPicPr>
-                    <pic:cNvPr descr="../screenshots/task_pytest-v.png" id="53" name="Picture"/>
+                    <pic:cNvPr descr="../screenshots/task_pytest-v.png" id="56" name="Picture"/>
                     <pic:cNvPicPr>
                       <a:picLocks noChangeArrowheads="1" noChangeAspect="1"/>
                     </pic:cNvPicPr>
                   </pic:nvPicPr>
                   <pic:blipFill>
-                    <a:blip r:embed="rId51"/>
+                    <a:blip r:embed="rId54"/>
                     <a:stretch>
                       <a:fillRect/>
                     </a:stretch>
@@ -3798,8 +3820,8 @@
         <w:t xml:space="preserve">Figure 11: All 24 unit tests passing</w:t>
       </w:r>
     </w:p>
-    <w:bookmarkEnd w:id="54"/>
-    <w:bookmarkStart w:id="61" w:name="workflow"/>
+    <w:bookmarkEnd w:id="57"/>
+    <w:bookmarkStart w:id="64" w:name="workflow"/>
     <w:p>
       <w:pPr>
         <w:pStyle w:val="Heading2"/>
@@ -4133,18 +4155,18 @@
           <wp:inline>
             <wp:extent cx="5334000" cy="3268085"/>
             <wp:effectExtent b="0" l="0" r="0" t="0"/>
-            <wp:docPr descr="Figure 12: Green pipeline run with the model summary" title="" id="56" name="Picture"/>
+            <wp:docPr descr="Figure 12: Green pipeline run with the model summary" title="" id="59" name="Picture"/>
             <a:graphic>
               <a:graphicData uri="http://schemas.openxmlformats.org/drawingml/2006/picture">
                 <pic:pic>
                   <pic:nvPicPr>
-                    <pic:cNvPr descr="../screenshots/task5_ci_pipeline_green.png" id="57" name="Picture"/>
+                    <pic:cNvPr descr="../screenshots/task5_ci_pipeline_green.png" id="60" name="Picture"/>
                     <pic:cNvPicPr>
                       <a:picLocks noChangeArrowheads="1" noChangeAspect="1"/>
                     </pic:cNvPicPr>
                   </pic:nvPicPr>
                   <pic:blipFill>
-                    <a:blip r:embed="rId55"/>
+                    <a:blip r:embed="rId58"/>
                     <a:stretch>
                       <a:fillRect/>
                     </a:stretch>
@@ -4188,18 +4210,18 @@
           <wp:inline>
             <wp:extent cx="5334000" cy="713950"/>
             <wp:effectExtent b="0" l="0" r="0" t="0"/>
-            <wp:docPr descr="Figure 13: Artifacts published by the pipeline" title="" id="59" name="Picture"/>
+            <wp:docPr descr="Figure 13: Artifacts published by the pipeline" title="" id="62" name="Picture"/>
             <a:graphic>
               <a:graphicData uri="http://schemas.openxmlformats.org/drawingml/2006/picture">
                 <pic:pic>
                   <pic:nvPicPr>
-                    <pic:cNvPr descr="../screenshots/task5_ci_summary_artifacts.png" id="60" name="Picture"/>
+                    <pic:cNvPr descr="../screenshots/task5_ci_summary_artifacts.png" id="63" name="Picture"/>
                     <pic:cNvPicPr>
                       <a:picLocks noChangeArrowheads="1" noChangeAspect="1"/>
                     </pic:cNvPicPr>
                   </pic:nvPicPr>
                   <pic:blipFill>
-                    <a:blip r:embed="rId58"/>
+                    <a:blip r:embed="rId61"/>
                     <a:stretch>
                       <a:fillRect/>
                     </a:stretch>
@@ -4234,8 +4256,8 @@
         <w:t xml:space="preserve">Figure 13: Artifacts published by the pipeline</w:t>
       </w:r>
     </w:p>
-    <w:bookmarkEnd w:id="61"/>
-    <w:bookmarkStart w:id="65" w:name="failure-demonstration"/>
+    <w:bookmarkEnd w:id="64"/>
+    <w:bookmarkStart w:id="68" w:name="failure-demonstration"/>
     <w:p>
       <w:pPr>
         <w:pStyle w:val="Heading2"/>
@@ -4270,18 +4292,18 @@
           <wp:inline>
             <wp:extent cx="5334000" cy="2174458"/>
             <wp:effectExtent b="0" l="0" r="0" t="0"/>
-            <wp:docPr descr="Figure 14: Pipeline stopping at the lint job" title="" id="63" name="Picture"/>
+            <wp:docPr descr="Figure 14: Pipeline stopping at the lint job" title="" id="66" name="Picture"/>
             <a:graphic>
               <a:graphicData uri="http://schemas.openxmlformats.org/drawingml/2006/picture">
                 <pic:pic>
                   <pic:nvPicPr>
-                    <pic:cNvPr descr="../screenshots/task5_ci_failure_demo.png" id="64" name="Picture"/>
+                    <pic:cNvPr descr="../screenshots/task5_ci_failure_demo.png" id="67" name="Picture"/>
                     <pic:cNvPicPr>
                       <a:picLocks noChangeArrowheads="1" noChangeAspect="1"/>
                     </pic:cNvPicPr>
                   </pic:nvPicPr>
                   <pic:blipFill>
-                    <a:blip r:embed="rId62"/>
+                    <a:blip r:embed="rId65"/>
                     <a:stretch>
                       <a:fillRect/>
                     </a:stretch>
@@ -4316,9 +4338,9 @@
         <w:t xml:space="preserve">Figure 14: Pipeline stopping at the lint job</w:t>
       </w:r>
     </w:p>
-    <w:bookmarkEnd w:id="65"/>
-    <w:bookmarkEnd w:id="66"/>
-    <w:bookmarkStart w:id="79" w:name="model-containerisation"/>
+    <w:bookmarkEnd w:id="68"/>
+    <w:bookmarkEnd w:id="69"/>
+    <w:bookmarkStart w:id="82" w:name="model-containerisation"/>
     <w:p>
       <w:pPr>
         <w:pStyle w:val="Heading1"/>
@@ -4838,18 +4860,18 @@
           <wp:inline>
             <wp:extent cx="5334000" cy="2579352"/>
             <wp:effectExtent b="0" l="0" r="0" t="0"/>
-            <wp:docPr descr="Figure 15: Docker image build" title="" id="68" name="Picture"/>
+            <wp:docPr descr="Figure 15: Docker image build" title="" id="71" name="Picture"/>
             <a:graphic>
               <a:graphicData uri="http://schemas.openxmlformats.org/drawingml/2006/picture">
                 <pic:pic>
                   <pic:nvPicPr>
-                    <pic:cNvPr descr="../screenshots/task_dockerbuild.png" id="69" name="Picture"/>
+                    <pic:cNvPr descr="../screenshots/task_dockerbuild.png" id="72" name="Picture"/>
                     <pic:cNvPicPr>
                       <a:picLocks noChangeArrowheads="1" noChangeAspect="1"/>
                     </pic:cNvPicPr>
                   </pic:nvPicPr>
                   <pic:blipFill>
-                    <a:blip r:embed="rId67"/>
+                    <a:blip r:embed="rId70"/>
                     <a:stretch>
                       <a:fillRect/>
                     </a:stretch>
@@ -4893,18 +4915,18 @@
           <wp:inline>
             <wp:extent cx="5334000" cy="1442577"/>
             <wp:effectExtent b="0" l="0" r="0" t="0"/>
-            <wp:docPr descr="Figure 16: Container running healthy and serving a prediction for the sample input" title="" id="71" name="Picture"/>
+            <wp:docPr descr="Figure 16: Container running healthy and serving a prediction for the sample input" title="" id="74" name="Picture"/>
             <a:graphic>
               <a:graphicData uri="http://schemas.openxmlformats.org/drawingml/2006/picture">
                 <pic:pic>
                   <pic:nvPicPr>
-                    <pic:cNvPr descr="../screenshots/task6_docker_predict.png" id="72" name="Picture"/>
+                    <pic:cNvPr descr="../screenshots/task6_docker_predict.png" id="75" name="Picture"/>
                     <pic:cNvPicPr>
                       <a:picLocks noChangeArrowheads="1" noChangeAspect="1"/>
                     </pic:cNvPicPr>
                   </pic:nvPicPr>
                   <pic:blipFill>
-                    <a:blip r:embed="rId70"/>
+                    <a:blip r:embed="rId73"/>
                     <a:stretch>
                       <a:fillRect/>
                     </a:stretch>
@@ -4948,18 +4970,18 @@
           <wp:inline>
             <wp:extent cx="5334000" cy="10676334"/>
             <wp:effectExtent b="0" l="0" r="0" t="0"/>
-            <wp:docPr descr="Figure 17: Successful prediction (HTTP 200) through Swagger" title="" id="74" name="Picture"/>
+            <wp:docPr descr="Figure 17: Successful prediction (HTTP 200) through Swagger" title="" id="77" name="Picture"/>
             <a:graphic>
               <a:graphicData uri="http://schemas.openxmlformats.org/drawingml/2006/picture">
                 <pic:pic>
                   <pic:nvPicPr>
-                    <pic:cNvPr descr="../screenshots/task_swagger_200_response.png" id="75" name="Picture"/>
+                    <pic:cNvPr descr="../screenshots/task_swagger_200_response.png" id="78" name="Picture"/>
                     <pic:cNvPicPr>
                       <a:picLocks noChangeArrowheads="1" noChangeAspect="1"/>
                     </pic:cNvPicPr>
                   </pic:nvPicPr>
                   <pic:blipFill>
-                    <a:blip r:embed="rId73"/>
+                    <a:blip r:embed="rId76"/>
                     <a:stretch>
                       <a:fillRect/>
                     </a:stretch>
@@ -5003,18 +5025,18 @@
           <wp:inline>
             <wp:extent cx="5334000" cy="5117306"/>
             <wp:effectExtent b="0" l="0" r="0" t="0"/>
-            <wp:docPr descr="Figure 18: Invalid input rejected with HTTP 422" title="" id="77" name="Picture"/>
+            <wp:docPr descr="Figure 18: Invalid input rejected with HTTP 422" title="" id="80" name="Picture"/>
             <a:graphic>
               <a:graphicData uri="http://schemas.openxmlformats.org/drawingml/2006/picture">
                 <pic:pic>
                   <pic:nvPicPr>
-                    <pic:cNvPr descr="../screenshots/task_swagger_422_validation.png" id="78" name="Picture"/>
+                    <pic:cNvPr descr="../screenshots/task_swagger_422_validation.png" id="81" name="Picture"/>
                     <pic:cNvPicPr>
                       <a:picLocks noChangeArrowheads="1" noChangeAspect="1"/>
                     </pic:cNvPicPr>
                   </pic:nvPicPr>
                   <pic:blipFill>
-                    <a:blip r:embed="rId76"/>
+                    <a:blip r:embed="rId79"/>
                     <a:stretch>
                       <a:fillRect/>
                     </a:stretch>
@@ -5049,8 +5071,8 @@
         <w:t xml:space="preserve">Figure 18: Invalid input rejected with HTTP 422</w:t>
       </w:r>
     </w:p>
-    <w:bookmarkEnd w:id="79"/>
-    <w:bookmarkStart w:id="89" w:name="production-deployment-kubernetes"/>
+    <w:bookmarkEnd w:id="82"/>
+    <w:bookmarkStart w:id="92" w:name="production-deployment-kubernetes"/>
     <w:p>
       <w:pPr>
         <w:pStyle w:val="Heading1"/>
@@ -5280,18 +5302,18 @@
           <wp:inline>
             <wp:extent cx="5334000" cy="2689017"/>
             <wp:effectExtent b="0" l="0" r="0" t="0"/>
-            <wp:docPr descr="Figure 19: Pods and services in the mlops namespace" title="" id="81" name="Picture"/>
+            <wp:docPr descr="Figure 19: Pods and services in the mlops namespace" title="" id="84" name="Picture"/>
             <a:graphic>
               <a:graphicData uri="http://schemas.openxmlformats.org/drawingml/2006/picture">
                 <pic:pic>
                   <pic:nvPicPr>
-                    <pic:cNvPr descr="../screenshots/task7_k8s_pods_services.png" id="82" name="Picture"/>
+                    <pic:cNvPr descr="../screenshots/task7_k8s_pods_services.png" id="85" name="Picture"/>
                     <pic:cNvPicPr>
                       <a:picLocks noChangeArrowheads="1" noChangeAspect="1"/>
                     </pic:cNvPicPr>
                   </pic:nvPicPr>
                   <pic:blipFill>
-                    <a:blip r:embed="rId80"/>
+                    <a:blip r:embed="rId83"/>
                     <a:stretch>
                       <a:fillRect/>
                     </a:stretch>
@@ -5335,18 +5357,18 @@
           <wp:inline>
             <wp:extent cx="5334000" cy="2082093"/>
             <wp:effectExtent b="0" l="0" r="0" t="0"/>
-            <wp:docPr descr="Figure 20: Prediction through the LoadBalancer" title="" id="84" name="Picture"/>
+            <wp:docPr descr="Figure 20: Prediction through the LoadBalancer" title="" id="87" name="Picture"/>
             <a:graphic>
               <a:graphicData uri="http://schemas.openxmlformats.org/drawingml/2006/picture">
                 <pic:pic>
                   <pic:nvPicPr>
-                    <pic:cNvPr descr="../screenshots/task7_k8s_loadbalancer_predict.png" id="85" name="Picture"/>
+                    <pic:cNvPr descr="../screenshots/task7_k8s_loadbalancer_predict.png" id="88" name="Picture"/>
                     <pic:cNvPicPr>
                       <a:picLocks noChangeArrowheads="1" noChangeAspect="1"/>
                     </pic:cNvPicPr>
                   </pic:nvPicPr>
                   <pic:blipFill>
-                    <a:blip r:embed="rId83"/>
+                    <a:blip r:embed="rId86"/>
                     <a:stretch>
                       <a:fillRect/>
                     </a:stretch>
@@ -5390,18 +5412,18 @@
           <wp:inline>
             <wp:extent cx="5334000" cy="1366462"/>
             <wp:effectExtent b="0" l="0" r="0" t="0"/>
-            <wp:docPr descr="Figure 21: Self-healing after a pod is deleted" title="" id="87" name="Picture"/>
+            <wp:docPr descr="Figure 21: Self-healing after a pod is deleted" title="" id="90" name="Picture"/>
             <a:graphic>
               <a:graphicData uri="http://schemas.openxmlformats.org/drawingml/2006/picture">
                 <pic:pic>
                   <pic:nvPicPr>
-                    <pic:cNvPr descr="../screenshots/task7_k8s_self_healing.png" id="88" name="Picture"/>
+                    <pic:cNvPr descr="../screenshots/task7_k8s_self_healing.png" id="91" name="Picture"/>
                     <pic:cNvPicPr>
                       <a:picLocks noChangeArrowheads="1" noChangeAspect="1"/>
                     </pic:cNvPicPr>
                   </pic:nvPicPr>
                   <pic:blipFill>
-                    <a:blip r:embed="rId86"/>
+                    <a:blip r:embed="rId89"/>
                     <a:stretch>
                       <a:fillRect/>
                     </a:stretch>
@@ -5436,8 +5458,8 @@
         <w:t xml:space="preserve">Figure 21: Self-healing after a pod is deleted</w:t>
       </w:r>
     </w:p>
-    <w:bookmarkEnd w:id="89"/>
-    <w:bookmarkStart w:id="102" w:name="monitoring-and-logging"/>
+    <w:bookmarkEnd w:id="92"/>
+    <w:bookmarkStart w:id="105" w:name="monitoring-and-logging"/>
     <w:p>
       <w:pPr>
         <w:pStyle w:val="Heading1"/>
@@ -5583,18 +5605,18 @@
           <wp:inline>
             <wp:extent cx="5334000" cy="2615193"/>
             <wp:effectExtent b="0" l="0" r="0" t="0"/>
-            <wp:docPr descr="Figure 22: API request logs from both pods" title="" id="91" name="Picture"/>
+            <wp:docPr descr="Figure 22: API request logs from both pods" title="" id="94" name="Picture"/>
             <a:graphic>
               <a:graphicData uri="http://schemas.openxmlformats.org/drawingml/2006/picture">
                 <pic:pic>
                   <pic:nvPicPr>
-                    <pic:cNvPr descr="../screenshots/task_api_logs.png" id="92" name="Picture"/>
+                    <pic:cNvPr descr="../screenshots/task_api_logs.png" id="95" name="Picture"/>
                     <pic:cNvPicPr>
                       <a:picLocks noChangeArrowheads="1" noChangeAspect="1"/>
                     </pic:cNvPicPr>
                   </pic:nvPicPr>
                   <pic:blipFill>
-                    <a:blip r:embed="rId90"/>
+                    <a:blip r:embed="rId93"/>
                     <a:stretch>
                       <a:fillRect/>
                     </a:stretch>
@@ -5638,18 +5660,18 @@
           <wp:inline>
             <wp:extent cx="5334000" cy="2211794"/>
             <wp:effectExtent b="0" l="0" r="0" t="0"/>
-            <wp:docPr descr="Figure 23: Prometheus targets (both pods UP)" title="" id="94" name="Picture"/>
+            <wp:docPr descr="Figure 23: Prometheus targets (both pods UP)" title="" id="97" name="Picture"/>
             <a:graphic>
               <a:graphicData uri="http://schemas.openxmlformats.org/drawingml/2006/picture">
                 <pic:pic>
                   <pic:nvPicPr>
-                    <pic:cNvPr descr="../screenshots/task_prometheus_dashboard.png" id="95" name="Picture"/>
+                    <pic:cNvPr descr="../screenshots/task_prometheus_dashboard.png" id="98" name="Picture"/>
                     <pic:cNvPicPr>
                       <a:picLocks noChangeArrowheads="1" noChangeAspect="1"/>
                     </pic:cNvPicPr>
                   </pic:nvPicPr>
                   <pic:blipFill>
-                    <a:blip r:embed="rId93"/>
+                    <a:blip r:embed="rId96"/>
                     <a:stretch>
                       <a:fillRect/>
                     </a:stretch>
@@ -5693,18 +5715,18 @@
           <wp:inline>
             <wp:extent cx="5334000" cy="2253802"/>
             <wp:effectExtent b="0" l="0" r="0" t="0"/>
-            <wp:docPr descr="Figure 24: Request rate in Prometheus, sum(rate(http_requests_total[1m]))" title="" id="97" name="Picture"/>
+            <wp:docPr descr="Figure 24: Request rate in Prometheus, sum(rate(http_requests_total[1m]))" title="" id="100" name="Picture"/>
             <a:graphic>
               <a:graphicData uri="http://schemas.openxmlformats.org/drawingml/2006/picture">
                 <pic:pic>
                   <pic:nvPicPr>
-                    <pic:cNvPr descr="../screenshots/task_prometheus_every_graph.png" id="98" name="Picture"/>
+                    <pic:cNvPr descr="../screenshots/task_prometheus_every_graph.png" id="101" name="Picture"/>
                     <pic:cNvPicPr>
                       <a:picLocks noChangeArrowheads="1" noChangeAspect="1"/>
                     </pic:cNvPicPr>
                   </pic:nvPicPr>
                   <pic:blipFill>
-                    <a:blip r:embed="rId96"/>
+                    <a:blip r:embed="rId99"/>
                     <a:stretch>
                       <a:fillRect/>
                     </a:stretch>
@@ -5748,18 +5770,18 @@
           <wp:inline>
             <wp:extent cx="5334000" cy="2621089"/>
             <wp:effectExtent b="0" l="0" r="0" t="0"/>
-            <wp:docPr descr="Figure 25: Grafana monitoring dashboard with live data" title="" id="100" name="Picture"/>
+            <wp:docPr descr="Figure 25: Grafana monitoring dashboard with live data" title="" id="103" name="Picture"/>
             <a:graphic>
               <a:graphicData uri="http://schemas.openxmlformats.org/drawingml/2006/picture">
                 <pic:pic>
                   <pic:nvPicPr>
-                    <pic:cNvPr descr="../screenshots/task_grafana_dashboard.png" id="101" name="Picture"/>
+                    <pic:cNvPr descr="../screenshots/task_grafana_dashboard.png" id="104" name="Picture"/>
                     <pic:cNvPicPr>
                       <a:picLocks noChangeArrowheads="1" noChangeAspect="1"/>
                     </pic:cNvPicPr>
                   </pic:nvPicPr>
                   <pic:blipFill>
-                    <a:blip r:embed="rId99"/>
+                    <a:blip r:embed="rId102"/>
                     <a:stretch>
                       <a:fillRect/>
                     </a:stretch>
@@ -5794,8 +5816,8 @@
         <w:t xml:space="preserve">Figure 25: Grafana monitoring dashboard with live data</w:t>
       </w:r>
     </w:p>
-    <w:bookmarkEnd w:id="102"/>
-    <w:bookmarkStart w:id="103" w:name="challenges-and-solutions"/>
+    <w:bookmarkEnd w:id="105"/>
+    <w:bookmarkStart w:id="106" w:name="challenges-and-solutions"/>
     <w:p>
       <w:pPr>
         <w:pStyle w:val="Heading1"/>
@@ -6128,8 +6150,8 @@
         </w:tc>
       </w:tr>
     </w:tbl>
-    <w:bookmarkEnd w:id="103"/>
-    <w:bookmarkStart w:id="104" w:name="conclusion-and-future-work"/>
+    <w:bookmarkEnd w:id="106"/>
+    <w:bookmarkStart w:id="107" w:name="conclusion-and-future-work"/>
     <w:p>
       <w:pPr>
         <w:pStyle w:val="Heading1"/>
@@ -6182,8 +6204,8 @@
         <w:t xml:space="preserve">Training the model was the smallest part of this project. Most of the effort went into making it repeatable and safe: validating the data, tracking every run, writing tests, and making the pipeline stop on bad code. I also learned that the “best” model depends on the cost of mistakes. I chose a threshold that catches every sick patient, even though it adds some false alarms.</w:t>
       </w:r>
     </w:p>
-    <w:bookmarkEnd w:id="104"/>
-    <w:bookmarkStart w:id="105" w:name="appendix-a-repository-structure"/>
+    <w:bookmarkEnd w:id="107"/>
+    <w:bookmarkStart w:id="108" w:name="appendix-a-repository-structure"/>
     <w:p>
       <w:pPr>
         <w:pStyle w:val="Heading1"/>
@@ -6329,7 +6351,7 @@
         <w:t xml:space="preserve">└── README.md                  Setup and access instructions</w:t>
       </w:r>
     </w:p>
-    <w:bookmarkEnd w:id="105"/>
+    <w:bookmarkEnd w:id="108"/>
     <w:sectPr>
       <w:footnotePr>
         <w:numRestart w:val="eachSect"/>

</xml_diff>